<commit_message>
update: title and gap analysis
</commit_message>
<xml_diff>
--- a/Proposal_Approval_Form_Filled.docx
+++ b/Proposal_Approval_Form_Filled.docx
@@ -1,6 +1,6 @@
 
 <file path=word/document.xml><?xml version="1.0" encoding="UTF-8" standalone="yes"?>
-<w:document xmlns:wpc="http://schemas.microsoft.com/office/word/2010/wordprocessingCanvas" xmlns:cx="http://schemas.microsoft.com/office/drawing/2014/chartex" xmlns:cx1="http://schemas.microsoft.com/office/drawing/2015/9/8/chartex" xmlns:cx2="http://schemas.microsoft.com/office/drawing/2015/10/21/chartex" xmlns:cx3="http://schemas.microsoft.com/office/drawing/2016/5/9/chartex" xmlns:cx4="http://schemas.microsoft.com/office/drawing/2016/5/10/chartex" xmlns:cx5="http://schemas.microsoft.com/office/drawing/2016/5/11/chartex" xmlns:cx6="http://schemas.microsoft.com/office/drawing/2016/5/12/chartex" xmlns:cx7="http://schemas.microsoft.com/office/drawing/2016/5/13/chartex" xmlns:cx8="http://schemas.microsoft.com/office/drawing/2016/5/14/chartex" xmlns:mc="http://schemas.openxmlformats.org/markup-compatibility/2006" xmlns:aink="http://schemas.microsoft.com/office/drawing/2016/ink" xmlns:am3d="http://schemas.microsoft.com/office/drawing/2017/model3d" xmlns:o="urn:schemas-microsoft-com:office:office" xmlns:r="http://schemas.openxmlformats.org/officeDocument/2006/relationships" xmlns:m="http://schemas.openxmlformats.org/officeDocument/2006/math" xmlns:v="urn:schemas-microsoft-com:vml" xmlns:wp14="http://schemas.microsoft.com/office/word/2010/wordprocessingDrawing" xmlns:wp="http://schemas.openxmlformats.org/drawingml/2006/wordprocessingDrawing" xmlns:w10="urn:schemas-microsoft-com:office:word" xmlns:w="http://schemas.openxmlformats.org/wordprocessingml/2006/main" xmlns:w14="http://schemas.microsoft.com/office/word/2010/wordml" xmlns:w15="http://schemas.microsoft.com/office/word/2012/wordml" xmlns:w16cid="http://schemas.microsoft.com/office/word/2016/wordml/cid" xmlns:w16se="http://schemas.microsoft.com/office/word/2015/wordml/symex" xmlns:wpg="http://schemas.microsoft.com/office/word/2010/wordprocessingGroup" xmlns:wpi="http://schemas.microsoft.com/office/word/2010/wordprocessingInk" xmlns:wne="http://schemas.microsoft.com/office/word/2006/wordml" xmlns:wps="http://schemas.microsoft.com/office/word/2010/wordprocessingShape" mc:Ignorable="w14 w15 w16se w16cid wp14"><w:body><w:p><w:pPr><w:ind w:left="-540"/><w:rPr><w:rFonts w:ascii="Times New Roman" w:eastAsia="Times New Roman" w:hAnsi="Times New Roman" w:cs="Times New Roman"/></w:rPr></w:pPr><w:r><w:rPr><w:noProof/></w:rPr><w:drawing><wp:anchor distT="0" distB="0" distL="0" distR="0" simplePos="0" relativeHeight="251659264" behindDoc="1" locked="0" layoutInCell="1" hidden="0" allowOverlap="1" wp14:anchorId="779B153C" wp14:editId="10431AFF"><wp:simplePos x="0" y="0"/><wp:positionH relativeFrom="column"><wp:posOffset>2372995</wp:posOffset></wp:positionH><wp:positionV relativeFrom="paragraph"><wp:posOffset>-346710</wp:posOffset></wp:positionV><wp:extent cx="550985" cy="574431"/><wp:effectExtent l="0" t="0" r="1905" b="0"/><wp:wrapNone/><wp:docPr id="2" name="image1.jpg"/><wp:cNvGraphicFramePr/><a:graphic xmlns:a="http://schemas.openxmlformats.org/drawingml/2006/main"><a:graphicData uri="http://schemas.openxmlformats.org/drawingml/2006/picture"><pic:pic xmlns:pic="http://schemas.openxmlformats.org/drawingml/2006/picture"><pic:nvPicPr><pic:cNvPr id="2" name="image1.jpg"/><pic:cNvPicPr preferRelativeResize="0"/></pic:nvPicPr><pic:blipFill><a:blip r:embed="rId8" cstate="print"><a:extLst><a:ext uri="{28A0092B-C50C-407E-A947-70E740481C1C}"><a14:useLocalDpi xmlns:a14="http://schemas.microsoft.com/office/drawing/2010/main" val="0"/></a:ext></a:extLst></a:blip><a:stretch><a:fillRect/></a:stretch></pic:blipFill><pic:spPr><a:xfrm><a:off x="0" y="0"/><a:ext cx="550985" cy="574431"/></a:xfrm><a:prstGeom prst="rect"><a:avLst/></a:prstGeom><a:ln/></pic:spPr></pic:pic></a:graphicData></a:graphic><wp14:sizeRelH relativeFrom="margin"><wp14:pctWidth>0</wp14:pctWidth></wp14:sizeRelH><wp14:sizeRelV relativeFrom="margin"><wp14:pctHeight>0</wp14:pctHeight></wp14:sizeRelV></wp:anchor></w:drawing></w:r></w:p><w:p><w:pPr><w:spacing w:after="0"/><w:jc w:val="center"/><w:rPr><w:rFonts w:ascii="Times New Roman" w:eastAsia="Times New Roman" w:hAnsi="Times New Roman" w:cs="Times New Roman"/><w:sz w:val="28"/><w:szCs w:val="28"/></w:rPr></w:pPr><w:r><w:rPr><w:rFonts w:ascii="Times New Roman" w:eastAsia="Times New Roman" w:hAnsi="Times New Roman" w:cs="Times New Roman"/><w:b/><w:color w:val="000000"/><w:sz w:val="28"/><w:szCs w:val="28"/></w:rPr><w:t>Daffodil International University</w:t></w:r></w:p><w:p><w:pPr><w:spacing w:after="0"/><w:jc w:val="center"/><w:rPr><w:rFonts w:ascii="Times New Roman" w:eastAsia="Times New Roman" w:hAnsi="Times New Roman" w:cs="Times New Roman"/><w:sz w:val="28"/><w:szCs w:val="28"/></w:rPr></w:pPr><w:r><w:rPr><w:rFonts w:ascii="Times New Roman" w:eastAsia="Times New Roman" w:hAnsi="Times New Roman" w:cs="Times New Roman"/><w:b/><w:color w:val="000000"/><w:sz w:val="28"/><w:szCs w:val="28"/></w:rPr><w:t>Department of Computer Science and Engineering</w:t></w:r></w:p><w:p><w:pPr><w:jc w:val="center"/><w:rPr><w:rFonts w:ascii="Times New Roman" w:eastAsia="Times New Roman" w:hAnsi="Times New Roman" w:cs="Times New Roman"/><w:b/><w:sz w:val="28"/><w:szCs w:val="28"/></w:rPr></w:pPr><w:bookmarkStart w:id="0" w:name="_heading=h.gjdgxs" w:colFirst="0" w:colLast="0"/><w:bookmarkEnd w:id="0"/><w:r><w:rPr><w:rFonts w:ascii="Times New Roman" w:eastAsia="Times New Roman" w:hAnsi="Times New Roman" w:cs="Times New Roman"/><w:b/><w:color w:val="000000"/><w:sz w:val="28"/><w:szCs w:val="28"/></w:rPr><w:t xml:space="preserve">Course Code: </w:t></w:r><w:r><w:rPr><w:rFonts w:ascii="Times New Roman" w:eastAsia="Times New Roman" w:hAnsi="Times New Roman" w:cs="Times New Roman"/><w:color w:val="000000"/><w:sz w:val="28"/><w:szCs w:val="28"/></w:rPr><w:t>CSE499</w:t></w:r><w:r><w:rPr><w:rFonts w:ascii="Times New Roman" w:eastAsia="Times New Roman" w:hAnsi="Times New Roman" w:cs="Times New Roman"/><w:b/><w:color w:val="000000"/><w:sz w:val="28"/><w:szCs w:val="28"/></w:rPr><w:tab/><w:t xml:space="preserve">Title: </w:t></w:r><w:r><w:rPr><w:rFonts w:ascii="Times New Roman" w:eastAsia="Times New Roman" w:hAnsi="Times New Roman" w:cs="Times New Roman"/><w:color w:val="000000"/><w:sz w:val="28"/><w:szCs w:val="28"/></w:rPr><w:t>FYDP (Title Defense)</w:t></w:r></w:p><w:p><w:pPr><w:jc w:val="center"/><w:rPr><w:rFonts w:ascii="Times New Roman" w:eastAsia="Times New Roman" w:hAnsi="Times New Roman" w:cs="Times New Roman"/><w:b/><w:color w:val="943634" w:themeColor="accent2" w:themeShade="BF"/><w:sz w:val="32"/><w:szCs w:val="32"/></w:rPr></w:pPr><w:r><w:rPr><w:rFonts w:ascii="Times New Roman" w:eastAsia="Times New Roman" w:hAnsi="Times New Roman" w:cs="Times New Roman"/><w:b/><w:color w:val="943634" w:themeColor="accent2" w:themeShade="BF"/><w:sz w:val="32"/><w:szCs w:val="32"/></w:rPr><w:t>Proposal</w:t></w:r><w:r><w:rPr><w:rFonts w:ascii="Times New Roman" w:eastAsia="Times New Roman" w:hAnsi="Times New Roman" w:cs="Times New Roman"/><w:b/><w:color w:val="943634" w:themeColor="accent2" w:themeShade="BF"/><w:sz w:val="32"/><w:szCs w:val="32"/></w:rPr><w:t xml:space="preserve"> Approval Form</w:t></w:r></w:p><w:tbl><w:tblPr><w:tblW w:w="10165" w:type="dxa"/><w:jc w:val="center"/><w:tblBorders><w:top w:val="single" w:sz="4" w:space="0" w:color="000000"/><w:left w:val="single" w:sz="4" w:space="0" w:color="000000"/><w:bottom w:val="single" w:sz="4" w:space="0" w:color="000000"/><w:right w:val="single" w:sz="4" w:space="0" w:color="000000"/><w:insideH w:val="single" w:sz="4" w:space="0" w:color="000000"/><w:insideV w:val="single" w:sz="4" w:space="0" w:color="000000"/></w:tblBorders><w:tblLayout w:type="fixed"/><w:tblLook w:val="0400" w:firstRow="0" w:lastRow="0" w:firstColumn="0" w:lastColumn="0" w:noHBand="0" w:noVBand="1"/></w:tblPr><w:tblGrid><w:gridCol w:w="2113"/><w:gridCol w:w="2332"/><w:gridCol w:w="1770"/><w:gridCol w:w="3950"/></w:tblGrid><w:tr><w:trPr><w:trHeight w:val="432"/><w:jc w:val="center"/></w:trPr><w:tc><w:tcPr><w:tcW w:w="10165" w:type="dxa"/><w:gridSpan w:val="4"/><w:shd w:val="clear" w:color="auto" w:fill="E7E6E6"/><w:vAlign w:val="center"/></w:tcPr><w:p><w:pPr><w:numPr><w:ilvl w:val="0"/><w:numId w:val="10"/></w:numPr><w:pBdr><w:top w:val="nil"/><w:left w:val="nil"/><w:bottom w:val="nil"/><w:right w:val="nil"/><w:between w:val="nil"/></w:pBdr><w:spacing w:after="160" w:line="259" w:lineRule="auto"/><w:rPr><w:rFonts w:ascii="Times New Roman" w:eastAsia="Times New Roman" w:hAnsi="Times New Roman" w:cs="Times New Roman"/><w:b/><w:color w:val="000000"/><w:sz w:val="24"/><w:szCs w:val="24"/></w:rPr></w:pPr><w:r><w:rPr><w:rFonts w:ascii="Times New Roman" w:eastAsia="Times New Roman" w:hAnsi="Times New Roman" w:cs="Times New Roman"/><w:b/><w:color w:val="000000"/><w:sz w:val="24"/><w:szCs w:val="24"/></w:rPr><w:t>1</w:t></w:r><w:r><w:rPr><w:rFonts w:ascii="Times New Roman" w:eastAsia="Times New Roman" w:hAnsi="Times New Roman" w:cs="Times New Roman"/><w:b/><w:color w:val="000000"/><w:sz w:val="24"/><w:szCs w:val="24"/><w:vertAlign w:val="superscript"/></w:rPr><w:t>st</w:t></w:r><w:r><w:rPr><w:rFonts w:ascii="Times New Roman" w:eastAsia="Times New Roman" w:hAnsi="Times New Roman" w:cs="Times New Roman"/><w:b/><w:color w:val="000000"/><w:sz w:val="24"/><w:szCs w:val="24"/></w:rPr><w:t xml:space="preserve"> Member information</w:t></w:r></w:p></w:tc></w:tr><w:tr><w:trPr><w:trHeight w:val="540"/><w:jc w:val="center"/></w:trPr><w:tc><w:tcPr><w:tcW w:w="2113" w:type="dxa"/><w:vAlign w:val="center"/></w:tcPr><w:p><w:pPr><w:rPr><w:rFonts w:ascii="Times New Roman" w:eastAsia="Times New Roman" w:hAnsi="Times New Roman" w:cs="Times New Roman"/><w:b/><w:sz w:val="24"/><w:szCs w:val="24"/></w:rPr></w:pPr><w:r><w:rPr><w:rFonts w:ascii="Times New Roman" w:eastAsia="Times New Roman" w:hAnsi="Times New Roman" w:cs="Times New Roman"/><w:b/><w:sz w:val="24"/><w:szCs w:val="24"/></w:rPr><w:t>Student ID:</w:t></w:r></w:p></w:tc><w:tc><w:tcPr><w:tcW w:w="2332" w:type="dxa"/><w:vAlign w:val="center"/></w:tcPr><w:p><w:pPr><w:rPr><w:rFonts w:ascii="Times New Roman" w:eastAsia="Times New Roman" w:hAnsi="Times New Roman" w:cs="Times New Roman"/><w:b/><w:sz w:val="24"/><w:szCs w:val="24"/></w:rPr></w:pPr></w:p></w:tc><w:tc><w:tcPr><w:tcW w:w="1770" w:type="dxa"/><w:vAlign w:val="center"/></w:tcPr><w:p><w:pPr><w:rPr><w:rFonts w:ascii="Times New Roman" w:eastAsia="Times New Roman" w:hAnsi="Times New Roman" w:cs="Times New Roman"/><w:b/><w:sz w:val="24"/><w:szCs w:val="24"/></w:rPr></w:pPr><w:r><w:rPr><w:rFonts w:ascii="Times New Roman" w:eastAsia="Times New Roman" w:hAnsi="Times New Roman" w:cs="Times New Roman"/><w:b/><w:sz w:val="24"/><w:szCs w:val="24"/></w:rPr><w:t>Student Name:</w:t></w:r></w:p></w:tc><w:tc><w:tcPr><w:tcW w:w="3950" w:type="dxa"/><w:vAlign w:val="center"/></w:tcPr><w:p><w:pPr><w:rPr><w:rFonts w:ascii="Times New Roman" w:eastAsia="Times New Roman" w:hAnsi="Times New Roman" w:cs="Times New Roman"/><w:b/><w:sz w:val="24"/><w:szCs w:val="24"/></w:rPr></w:pPr></w:p></w:tc></w:tr><w:tr><w:trPr><w:trHeight w:val="432"/><w:jc w:val="center"/></w:trPr><w:tc><w:tcPr><w:tcW w:w="10165" w:type="dxa"/><w:gridSpan w:val="4"/><w:shd w:val="clear" w:color="auto" w:fill="E7E6E6"/><w:vAlign w:val="center"/></w:tcPr><w:p><w:pPr><w:numPr><w:ilvl w:val="0"/><w:numId w:val="10"/></w:numPr><w:pBdr><w:top w:val="nil"/><w:left w:val="nil"/><w:bottom w:val="nil"/><w:right w:val="nil"/><w:between w:val="nil"/></w:pBdr><w:spacing w:after="160" w:line="259" w:lineRule="auto"/><w:rPr><w:rFonts w:ascii="Times New Roman" w:eastAsia="Times New Roman" w:hAnsi="Times New Roman" w:cs="Times New Roman"/><w:b/><w:color w:val="000000"/><w:sz w:val="24"/><w:szCs w:val="24"/></w:rPr></w:pPr><w:r><w:rPr><w:rFonts w:ascii="Times New Roman" w:eastAsia="Times New Roman" w:hAnsi="Times New Roman" w:cs="Times New Roman"/><w:b/><w:color w:val="000000"/><w:sz w:val="24"/><w:szCs w:val="24"/></w:rPr><w:t>2</w:t></w:r><w:r><w:rPr><w:rFonts w:ascii="Times New Roman" w:eastAsia="Times New Roman" w:hAnsi="Times New Roman" w:cs="Times New Roman"/><w:b/><w:color w:val="000000"/><w:sz w:val="24"/><w:szCs w:val="24"/><w:vertAlign w:val="superscript"/></w:rPr><w:t>nd</w:t></w:r><w:r><w:rPr><w:rFonts w:ascii="Times New Roman" w:eastAsia="Times New Roman" w:hAnsi="Times New Roman" w:cs="Times New Roman"/><w:b/><w:color w:val="000000"/><w:sz w:val="24"/><w:szCs w:val="24"/></w:rPr><w:t xml:space="preserve"> Member information [</w:t></w:r><w:r><w:rPr><w:rFonts w:ascii="Times New Roman" w:eastAsia="Times New Roman" w:hAnsi="Times New Roman" w:cs="Times New Roman"/><w:b/><w:i/><w:color w:val="000000"/><w:sz w:val="24"/><w:szCs w:val="24"/></w:rPr><w:t xml:space="preserve"> if there is any. Otherwise, skip this]</w:t></w:r></w:p></w:tc></w:tr><w:tr><w:trPr><w:trHeight w:val="540"/><w:jc w:val="center"/></w:trPr><w:tc><w:tcPr><w:tcW w:w="2113" w:type="dxa"/><w:vAlign w:val="center"/></w:tcPr><w:p><w:pPr><w:rPr><w:rFonts w:ascii="Times New Roman" w:eastAsia="Times New Roman" w:hAnsi="Times New Roman" w:cs="Times New Roman"/><w:b/><w:sz w:val="24"/><w:szCs w:val="24"/></w:rPr></w:pPr><w:r><w:rPr><w:rFonts w:ascii="Times New Roman" w:eastAsia="Times New Roman" w:hAnsi="Times New Roman" w:cs="Times New Roman"/><w:b/><w:sz w:val="24"/><w:szCs w:val="24"/></w:rPr><w:t>Student ID:</w:t></w:r></w:p></w:tc><w:tc><w:tcPr><w:tcW w:w="2332" w:type="dxa"/><w:vAlign w:val="center"/></w:tcPr><w:p><w:pPr><w:rPr><w:rFonts w:ascii="Times New Roman" w:eastAsia="Times New Roman" w:hAnsi="Times New Roman" w:cs="Times New Roman"/><w:b/><w:sz w:val="24"/><w:szCs w:val="24"/></w:rPr></w:pPr></w:p></w:tc><w:tc><w:tcPr><w:tcW w:w="1770" w:type="dxa"/><w:vAlign w:val="center"/></w:tcPr><w:p><w:pPr><w:rPr><w:rFonts w:ascii="Times New Roman" w:eastAsia="Times New Roman" w:hAnsi="Times New Roman" w:cs="Times New Roman"/><w:b/><w:sz w:val="24"/><w:szCs w:val="24"/></w:rPr></w:pPr><w:r><w:rPr><w:rFonts w:ascii="Times New Roman" w:eastAsia="Times New Roman" w:hAnsi="Times New Roman" w:cs="Times New Roman"/><w:b/><w:sz w:val="24"/><w:szCs w:val="24"/></w:rPr><w:t>Student Name:</w:t></w:r></w:p></w:tc><w:tc><w:tcPr><w:tcW w:w="3950" w:type="dxa"/><w:vAlign w:val="center"/></w:tcPr><w:p><w:pPr><w:rPr><w:rFonts w:ascii="Times New Roman" w:eastAsia="Times New Roman" w:hAnsi="Times New Roman" w:cs="Times New Roman"/><w:b/><w:sz w:val="24"/><w:szCs w:val="24"/></w:rPr></w:pPr></w:p></w:tc></w:tr><w:tr><w:trPr><w:trHeight w:val="510"/><w:jc w:val="center"/></w:trPr><w:tc><w:tcPr><w:tcW w:w="2113" w:type="dxa"/><w:vAlign w:val="center"/></w:tcPr><w:p><w:pPr><w:rPr><w:rFonts w:ascii="Times New Roman" w:eastAsia="Times New Roman" w:hAnsi="Times New Roman" w:cs="Times New Roman"/><w:b/><w:sz w:val="24"/><w:szCs w:val="24"/></w:rPr></w:pPr><w:r><w:rPr><w:rFonts w:ascii="Times New Roman" w:eastAsia="Times New Roman" w:hAnsi="Times New Roman" w:cs="Times New Roman"/><w:b/><w:sz w:val="24"/><w:szCs w:val="24"/></w:rPr><w:t>Semester:</w:t></w:r></w:p></w:tc><w:tc><w:tcPr><w:tcW w:w="2332" w:type="dxa"/><w:vAlign w:val="center"/></w:tcPr><w:p><w:pPr><w:rPr><w:rFonts w:ascii="Times New Roman" w:eastAsia="Times New Roman" w:hAnsi="Times New Roman" w:cs="Times New Roman"/><w:b/><w:sz w:val="24"/><w:szCs w:val="24"/></w:rPr></w:pPr></w:p></w:tc><w:tc><w:tcPr><w:tcW w:w="1770" w:type="dxa"/><w:vAlign w:val="center"/></w:tcPr><w:p><w:pPr><w:rPr><w:rFonts w:ascii="Times New Roman" w:eastAsia="Times New Roman" w:hAnsi="Times New Roman" w:cs="Times New Roman"/><w:b/><w:sz w:val="24"/><w:szCs w:val="24"/></w:rPr></w:pPr><w:r><w:rPr><w:rFonts w:ascii="Times New Roman" w:eastAsia="Times New Roman" w:hAnsi="Times New Roman" w:cs="Times New Roman"/><w:b/><w:sz w:val="24"/><w:szCs w:val="24"/></w:rPr><w:t>Date:</w:t></w:r></w:p></w:tc><w:tc><w:tcPr><w:tcW w:w="3950" w:type="dxa"/><w:vAlign w:val="center"/></w:tcPr><w:p><w:pPr><w:rPr><w:rFonts w:ascii="Times New Roman" w:eastAsia="Times New Roman" w:hAnsi="Times New Roman" w:cs="Times New Roman"/><w:b/><w:sz w:val="24"/><w:szCs w:val="24"/></w:rPr></w:pPr></w:p></w:tc></w:tr><w:tr><w:trPr><w:trHeight w:val="800"/><w:jc w:val="center"/></w:trPr><w:tc><w:tcPr><w:tcW w:w="2113" w:type="dxa"/><w:vAlign w:val="center"/></w:tcPr><w:p><w:pPr><w:rPr><w:rFonts w:ascii="Times New Roman" w:eastAsia="Times New Roman" w:hAnsi="Times New Roman" w:cs="Times New Roman"/><w:b/><w:sz w:val="24"/><w:szCs w:val="24"/></w:rPr></w:pPr><w:r><w:rPr><w:rFonts w:ascii="Times New Roman" w:eastAsia="Times New Roman" w:hAnsi="Times New Roman" w:cs="Times New Roman"/><w:b/><w:sz w:val="24"/><w:szCs w:val="24"/></w:rPr><w:t>III. Proposed Title:</w:t></w:r></w:p></w:tc><w:tc><w:tcPr><w:tcW w:w="8052" w:type="dxa"/><w:gridSpan w:val="3"/><w:vAlign w:val="center"/></w:tcPr><w:p><w:pPr><w:spacing w:line="240" w:lineRule="auto"/><w:rPr><w:rFonts w:ascii="Times New Roman" w:hAnsi="Times New Roman"/><w:b/><w:sz w:val="22"/><w:szCs w:val="22"/><w:color w:val="0F172A"/></w:rPr></w:pPr><w:r><w:rPr><w:rFonts w:ascii="Times New Roman" w:hAnsi="Times New Roman"/><w:b/><w:sz w:val="22"/><w:szCs w:val="22"/><w:color w:val="0F172A"/></w:rPr><w:t>Nirapod Parking: A Community-Driven Residential Parking Marketplace Using Java Spring Cloud Microservices, Angular, Keycloak OAuth2, and Geospatial Proximity Indexing</w:t></w:r></w:p></w:tc></w:tr><w:tr><w:trPr><w:trHeight w:val="953"/><w:jc w:val="center"/></w:trPr><w:tc><w:tcPr><w:tcW w:w="2113" w:type="dxa"/><w:vAlign w:val="center"/></w:tcPr><w:p><w:pPr><w:spacing w:after="0"/></w:pPr><w:r><w:rPr><w:rFonts w:ascii="Times New Roman" w:eastAsia="Times New Roman" w:hAnsi="Times New Roman" w:cs="Times New Roman"/><w:b/><w:sz w:val="24"/><w:szCs w:val="24"/></w:rPr><w:t>IV. Updated Title (</w:t></w:r><w:r><w:rPr><w:rFonts w:ascii="Times New Roman" w:eastAsia="Times New Roman" w:hAnsi="Times New Roman" w:cs="Times New Roman"/><w:sz w:val="24"/><w:szCs w:val="24"/></w:rPr><w:t>If there is any update</w:t></w:r><w:r><w:rPr><w:rFonts w:ascii="Times New Roman" w:eastAsia="Times New Roman" w:hAnsi="Times New Roman" w:cs="Times New Roman"/><w:b/><w:sz w:val="24"/><w:szCs w:val="24"/></w:rPr><w:t>):</w:t></w:r></w:p></w:tc><w:tc><w:tcPr><w:tcW w:w="8052" w:type="dxa"/><w:gridSpan w:val="3"/><w:vAlign w:val="center"/></w:tcPr><w:p><w:pPr><w:rPr><w:rFonts w:ascii="Times New Roman" w:eastAsia="Times New Roman" w:hAnsi="Times New Roman" w:cs="Times New Roman"/><w:b/><w:sz w:val="24"/><w:szCs w:val="24"/></w:rPr></w:pPr></w:p></w:tc></w:tr><w:tr><w:trPr><w:trHeight w:val="2438"/><w:jc w:val="center"/></w:trPr><w:tc><w:tcPr><w:tcW w:w="10165" w:type="dxa"/><w:gridSpan w:val="4"/><w:shd w:val="clear" w:color="auto" w:fill="E7E6E6"/></w:tcPr><w:p><w:pPr><w:jc w:val="both"/><w:rPr><w:rFonts w:ascii="Times New Roman" w:eastAsia="Times New Roman" w:hAnsi="Times New Roman" w:cs="Times New Roman"/><w:sz w:val="6"/><w:szCs w:val="6"/></w:rPr></w:pPr></w:p><w:p><w:pPr><w:jc w:val="both"/><w:rPr><w:rFonts w:ascii="Times New Roman" w:eastAsia="Times New Roman" w:hAnsi="Times New Roman" w:cs="Times New Roman"/><w:b/><w:sz w:val="24"/><w:szCs w:val="24"/></w:rPr></w:pPr><w:r><w:rPr><w:rFonts w:ascii="Times New Roman" w:eastAsia="Times New Roman" w:hAnsi="Times New Roman" w:cs="Times New Roman"/><w:sz w:val="24"/><w:szCs w:val="24"/></w:rPr><w:t xml:space="preserve">This is the approval for the Final Year Design Project (FYDP) proposal and title submitted by the above-mentioned student who is from the Department of CSE under my supervision. Upon thorough review and evaluation, it is my professional opinion that the </w:t></w:r><w:r><w:rPr><w:rFonts w:ascii="Times New Roman" w:eastAsia="Times New Roman" w:hAnsi="Times New Roman" w:cs="Times New Roman"/><w:b/><w:sz w:val="24"/><w:szCs w:val="24"/></w:rPr><w:t xml:space="preserve">proposed project title </w:t></w:r><w:r><w:rPr><w:rFonts w:ascii="Times New Roman" w:eastAsia="Times New Roman" w:hAnsi="Times New Roman" w:cs="Times New Roman"/><w:b/><w:i/></w:rPr><w:t>[mentioned in Sec III and IV]</w:t></w:r><w:r><w:rPr><w:rFonts w:ascii="Times New Roman" w:eastAsia="Times New Roman" w:hAnsi="Times New Roman" w:cs="Times New Roman"/><w:b/></w:rPr><w:t xml:space="preserve"> </w:t></w:r><w:r><w:rPr><w:rFonts w:ascii="Times New Roman" w:eastAsia="Times New Roman" w:hAnsi="Times New Roman" w:cs="Times New Roman"/><w:sz w:val="24"/><w:szCs w:val="24"/></w:rPr><w:t>is both relevant and aligned with the academic goals and standards of our department. I (Supervisor) have endorsed the proposed proposal and title. Under our department's guidelines, the student has fulfilled all the necessary prerequisites and will attach this Proposal Approval Form to their FYDP Title Phase Evaluation Report.</w:t></w:r></w:p></w:tc></w:tr><w:tr><w:trPr><w:trHeight w:val="432"/><w:jc w:val="center"/></w:trPr><w:tc><w:tcPr><w:tcW w:w="2113" w:type="dxa"/></w:tcPr><w:p><w:pPr><w:rPr><w:rFonts w:ascii="Times New Roman" w:eastAsia="Times New Roman" w:hAnsi="Times New Roman" w:cs="Times New Roman"/><w:b/><w:sz w:val="24"/><w:szCs w:val="24"/></w:rPr></w:pPr><w:r><w:rPr><w:rFonts w:ascii="Times New Roman" w:eastAsia="Times New Roman" w:hAnsi="Times New Roman" w:cs="Times New Roman"/><w:b/><w:sz w:val="24"/><w:szCs w:val="24"/></w:rPr><w:t xml:space="preserve">Supervisor Name: </w:t></w:r></w:p></w:tc><w:tc><w:tcPr><w:tcW w:w="8052" w:type="dxa"/><w:gridSpan w:val="3"/><w:vAlign w:val="center"/></w:tcPr><w:p><w:pPr><w:rPr><w:rFonts w:ascii="Times New Roman" w:eastAsia="Times New Roman" w:hAnsi="Times New Roman" w:cs="Times New Roman"/><w:b/><w:sz w:val="24"/><w:szCs w:val="24"/></w:rPr></w:pPr></w:p></w:tc></w:tr><w:tr><w:trPr><w:trHeight w:val="432"/><w:jc w:val="center"/></w:trPr><w:tc><w:tcPr><w:tcW w:w="2113" w:type="dxa"/></w:tcPr><w:p><w:pPr><w:rPr><w:rFonts w:ascii="Times New Roman" w:eastAsia="Times New Roman" w:hAnsi="Times New Roman" w:cs="Times New Roman"/><w:b/><w:sz w:val="24"/><w:szCs w:val="24"/></w:rPr></w:pPr><w:r><w:rPr><w:rFonts w:ascii="Times New Roman" w:eastAsia="Times New Roman" w:hAnsi="Times New Roman" w:cs="Times New Roman"/><w:b/><w:sz w:val="24"/><w:szCs w:val="24"/></w:rPr><w:t xml:space="preserve">Supervisor Designation: </w:t></w:r></w:p></w:tc><w:tc><w:tcPr><w:tcW w:w="8052" w:type="dxa"/><w:gridSpan w:val="3"/><w:vAlign w:val="center"/></w:tcPr><w:p><w:pPr><w:rPr><w:rFonts w:ascii="Times New Roman" w:eastAsia="Times New Roman" w:hAnsi="Times New Roman" w:cs="Times New Roman"/><w:b/><w:sz w:val="18"/><w:szCs w:val="24"/></w:rPr></w:pPr></w:p></w:tc></w:tr><w:tr><w:trPr><w:trHeight w:val="1790"/><w:jc w:val="center"/></w:trPr><w:tc><w:tcPr><w:tcW w:w="10165" w:type="dxa"/><w:gridSpan w:val="4"/><w:vAlign w:val="center"/></w:tcPr><w:p><w:pPr><w:ind w:right="71"/><w:jc w:val="center"/><w:rPr><w:rFonts w:ascii="Times New Roman" w:eastAsia="Times New Roman" w:hAnsi="Times New Roman" w:cs="Times New Roman"/><w:b/><w:sz w:val="24"/><w:szCs w:val="24"/><w:u w:val="single"/></w:rPr></w:pPr><w:r><w:rPr><w:rFonts w:ascii="Times New Roman" w:eastAsia="Times New Roman" w:hAnsi="Times New Roman" w:cs="Times New Roman"/><w:b/><w:sz w:val="24"/><w:szCs w:val="24"/><w:u w:val="single"/></w:rPr><w:t>Approved by:</w:t></w:r></w:p><w:p><w:pPr><w:ind w:right="71"/><w:rPr><w:rFonts w:ascii="Times New Roman" w:eastAsia="Times New Roman" w:hAnsi="Times New Roman" w:cs="Times New Roman"/><w:b/><w:sz w:val="14"/><w:szCs w:val="24"/></w:rPr></w:pPr></w:p><w:p><w:pPr><w:spacing w:after="0"/><w:ind w:right="71"/><w:jc w:val="center"/><w:rPr><w:rFonts w:ascii="Times New Roman" w:eastAsia="Times New Roman" w:hAnsi="Times New Roman" w:cs="Times New Roman"/><w:b/><w:sz w:val="24"/><w:szCs w:val="24"/></w:rPr></w:pPr><w:r><w:rPr><w:rFonts w:ascii="Times New Roman" w:eastAsia="Times New Roman" w:hAnsi="Times New Roman" w:cs="Times New Roman"/><w:b/><w:sz w:val="24"/><w:szCs w:val="24"/></w:rPr><w:t>___________________________</w:t></w:r></w:p><w:p><w:pPr><w:spacing w:after="0"/><w:ind w:right="71"/><w:jc w:val="center"/><w:rPr><w:rFonts w:ascii="Times New Roman" w:eastAsia="Times New Roman" w:hAnsi="Times New Roman" w:cs="Times New Roman"/><w:b/><w:sz w:val="24"/><w:szCs w:val="24"/></w:rPr></w:pPr><w:r><w:rPr><w:rFonts w:ascii="Times New Roman" w:eastAsia="Times New Roman" w:hAnsi="Times New Roman" w:cs="Times New Roman"/><w:b/><w:sz w:val="24"/><w:szCs w:val="24"/></w:rPr><w:t>Supervisor Signature with Date</w:t></w:r></w:p></w:tc></w:tr></w:tbl><w:p><w:pPr><w:p><w:r><w:br w:type="page"/></w:r></w:p>
+<w:document xmlns:wpc="http://schemas.microsoft.com/office/word/2010/wordprocessingCanvas" xmlns:cx="http://schemas.microsoft.com/office/drawing/2014/chartex" xmlns:cx1="http://schemas.microsoft.com/office/drawing/2015/9/8/chartex" xmlns:cx2="http://schemas.microsoft.com/office/drawing/2015/10/21/chartex" xmlns:cx3="http://schemas.microsoft.com/office/drawing/2016/5/9/chartex" xmlns:cx4="http://schemas.microsoft.com/office/drawing/2016/5/10/chartex" xmlns:cx5="http://schemas.microsoft.com/office/drawing/2016/5/11/chartex" xmlns:cx6="http://schemas.microsoft.com/office/drawing/2016/5/12/chartex" xmlns:cx7="http://schemas.microsoft.com/office/drawing/2016/5/13/chartex" xmlns:cx8="http://schemas.microsoft.com/office/drawing/2016/5/14/chartex" xmlns:mc="http://schemas.openxmlformats.org/markup-compatibility/2006" xmlns:aink="http://schemas.microsoft.com/office/drawing/2016/ink" xmlns:am3d="http://schemas.microsoft.com/office/drawing/2017/model3d" xmlns:o="urn:schemas-microsoft-com:office:office" xmlns:r="http://schemas.openxmlformats.org/officeDocument/2006/relationships" xmlns:m="http://schemas.openxmlformats.org/officeDocument/2006/math" xmlns:v="urn:schemas-microsoft-com:vml" xmlns:wp14="http://schemas.microsoft.com/office/word/2010/wordprocessingDrawing" xmlns:wp="http://schemas.openxmlformats.org/drawingml/2006/wordprocessingDrawing" xmlns:w10="urn:schemas-microsoft-com:office:word" xmlns:w="http://schemas.openxmlformats.org/wordprocessingml/2006/main" xmlns:w14="http://schemas.microsoft.com/office/word/2010/wordml" xmlns:w15="http://schemas.microsoft.com/office/word/2012/wordml" xmlns:w16cid="http://schemas.microsoft.com/office/word/2016/wordml/cid" xmlns:w16se="http://schemas.microsoft.com/office/word/2015/wordml/symex" xmlns:wpg="http://schemas.microsoft.com/office/word/2010/wordprocessingGroup" xmlns:wpi="http://schemas.microsoft.com/office/word/2010/wordprocessingInk" xmlns:wne="http://schemas.microsoft.com/office/word/2006/wordml" xmlns:wps="http://schemas.microsoft.com/office/word/2010/wordprocessingShape" mc:Ignorable="w14 w15 w16se w16cid wp14"><w:body><w:p><w:pPr><w:ind w:left="-540"/><w:rPr><w:rFonts w:ascii="Times New Roman" w:eastAsia="Times New Roman" w:hAnsi="Times New Roman" w:cs="Times New Roman"/></w:rPr></w:pPr><w:r><w:rPr><w:noProof/></w:rPr><w:drawing><wp:anchor distT="0" distB="0" distL="0" distR="0" simplePos="0" relativeHeight="251659264" behindDoc="1" locked="0" layoutInCell="1" hidden="0" allowOverlap="1" wp14:anchorId="779B153C" wp14:editId="10431AFF"><wp:simplePos x="0" y="0"/><wp:positionH relativeFrom="column"><wp:posOffset>2372995</wp:posOffset></wp:positionH><wp:positionV relativeFrom="paragraph"><wp:posOffset>-346710</wp:posOffset></wp:positionV><wp:extent cx="550985" cy="574431"/><wp:effectExtent l="0" t="0" r="1905" b="0"/><wp:wrapNone/><wp:docPr id="2" name="image1.jpg"/><wp:cNvGraphicFramePr/><a:graphic xmlns:a="http://schemas.openxmlformats.org/drawingml/2006/main"><a:graphicData uri="http://schemas.openxmlformats.org/drawingml/2006/picture"><pic:pic xmlns:pic="http://schemas.openxmlformats.org/drawingml/2006/picture"><pic:nvPicPr><pic:cNvPr id="2" name="image1.jpg"/><pic:cNvPicPr preferRelativeResize="0"/></pic:nvPicPr><pic:blipFill><a:blip r:embed="rId8" cstate="print"><a:extLst><a:ext uri="{28A0092B-C50C-407E-A947-70E740481C1C}"><a14:useLocalDpi xmlns:a14="http://schemas.microsoft.com/office/drawing/2010/main" val="0"/></a:ext></a:extLst></a:blip><a:stretch><a:fillRect/></a:stretch></pic:blipFill><pic:spPr><a:xfrm><a:off x="0" y="0"/><a:ext cx="550985" cy="574431"/></a:xfrm><a:prstGeom prst="rect"><a:avLst/></a:prstGeom><a:ln/></pic:spPr></pic:pic></a:graphicData></a:graphic><wp14:sizeRelH relativeFrom="margin"><wp14:pctWidth>0</wp14:pctWidth></wp14:sizeRelH><wp14:sizeRelV relativeFrom="margin"><wp14:pctHeight>0</wp14:pctHeight></wp14:sizeRelV></wp:anchor></w:drawing></w:r></w:p><w:p><w:pPr><w:spacing w:after="0"/><w:jc w:val="center"/><w:rPr><w:rFonts w:ascii="Times New Roman" w:eastAsia="Times New Roman" w:hAnsi="Times New Roman" w:cs="Times New Roman"/><w:sz w:val="28"/><w:szCs w:val="28"/></w:rPr></w:pPr><w:r><w:rPr><w:rFonts w:ascii="Times New Roman" w:eastAsia="Times New Roman" w:hAnsi="Times New Roman" w:cs="Times New Roman"/><w:b/><w:color w:val="000000"/><w:sz w:val="28"/><w:szCs w:val="28"/></w:rPr><w:t>Daffodil International University</w:t></w:r></w:p><w:p><w:pPr><w:spacing w:after="0"/><w:jc w:val="center"/><w:rPr><w:rFonts w:ascii="Times New Roman" w:eastAsia="Times New Roman" w:hAnsi="Times New Roman" w:cs="Times New Roman"/><w:sz w:val="28"/><w:szCs w:val="28"/></w:rPr></w:pPr><w:r><w:rPr><w:rFonts w:ascii="Times New Roman" w:eastAsia="Times New Roman" w:hAnsi="Times New Roman" w:cs="Times New Roman"/><w:b/><w:color w:val="000000"/><w:sz w:val="28"/><w:szCs w:val="28"/></w:rPr><w:t>Department of Computer Science and Engineering</w:t></w:r></w:p><w:p><w:pPr><w:jc w:val="center"/><w:rPr><w:rFonts w:ascii="Times New Roman" w:eastAsia="Times New Roman" w:hAnsi="Times New Roman" w:cs="Times New Roman"/><w:b/><w:sz w:val="28"/><w:szCs w:val="28"/></w:rPr></w:pPr><w:bookmarkStart w:id="0" w:name="_heading=h.gjdgxs" w:colFirst="0" w:colLast="0"/><w:bookmarkEnd w:id="0"/><w:r><w:rPr><w:rFonts w:ascii="Times New Roman" w:eastAsia="Times New Roman" w:hAnsi="Times New Roman" w:cs="Times New Roman"/><w:b/><w:color w:val="000000"/><w:sz w:val="28"/><w:szCs w:val="28"/></w:rPr><w:t xml:space="preserve">Course Code: </w:t></w:r><w:r><w:rPr><w:rFonts w:ascii="Times New Roman" w:eastAsia="Times New Roman" w:hAnsi="Times New Roman" w:cs="Times New Roman"/><w:color w:val="000000"/><w:sz w:val="28"/><w:szCs w:val="28"/></w:rPr><w:t>CSE499</w:t></w:r><w:r><w:rPr><w:rFonts w:ascii="Times New Roman" w:eastAsia="Times New Roman" w:hAnsi="Times New Roman" w:cs="Times New Roman"/><w:b/><w:color w:val="000000"/><w:sz w:val="28"/><w:szCs w:val="28"/></w:rPr><w:tab/><w:t xml:space="preserve">Title: </w:t></w:r><w:r><w:rPr><w:rFonts w:ascii="Times New Roman" w:eastAsia="Times New Roman" w:hAnsi="Times New Roman" w:cs="Times New Roman"/><w:color w:val="000000"/><w:sz w:val="28"/><w:szCs w:val="28"/></w:rPr><w:t>FYDP (Title Defense)</w:t></w:r></w:p><w:p><w:pPr><w:jc w:val="center"/><w:rPr><w:rFonts w:ascii="Times New Roman" w:eastAsia="Times New Roman" w:hAnsi="Times New Roman" w:cs="Times New Roman"/><w:b/><w:color w:val="943634" w:themeColor="accent2" w:themeShade="BF"/><w:sz w:val="32"/><w:szCs w:val="32"/></w:rPr></w:pPr><w:r><w:rPr><w:rFonts w:ascii="Times New Roman" w:eastAsia="Times New Roman" w:hAnsi="Times New Roman" w:cs="Times New Roman"/><w:b/><w:color w:val="943634" w:themeColor="accent2" w:themeShade="BF"/><w:sz w:val="32"/><w:szCs w:val="32"/></w:rPr><w:t>Proposal</w:t></w:r><w:r><w:rPr><w:rFonts w:ascii="Times New Roman" w:eastAsia="Times New Roman" w:hAnsi="Times New Roman" w:cs="Times New Roman"/><w:b/><w:color w:val="943634" w:themeColor="accent2" w:themeShade="BF"/><w:sz w:val="32"/><w:szCs w:val="32"/></w:rPr><w:t xml:space="preserve"> Approval Form</w:t></w:r></w:p><w:tbl><w:tblPr><w:tblW w:w="10165" w:type="dxa"/><w:jc w:val="center"/><w:tblBorders><w:top w:val="single" w:sz="4" w:space="0" w:color="000000"/><w:left w:val="single" w:sz="4" w:space="0" w:color="000000"/><w:bottom w:val="single" w:sz="4" w:space="0" w:color="000000"/><w:right w:val="single" w:sz="4" w:space="0" w:color="000000"/><w:insideH w:val="single" w:sz="4" w:space="0" w:color="000000"/><w:insideV w:val="single" w:sz="4" w:space="0" w:color="000000"/></w:tblBorders><w:tblLayout w:type="fixed"/><w:tblLook w:val="0400" w:firstRow="0" w:lastRow="0" w:firstColumn="0" w:lastColumn="0" w:noHBand="0" w:noVBand="1"/></w:tblPr><w:tblGrid><w:gridCol w:w="2113"/><w:gridCol w:w="2332"/><w:gridCol w:w="1770"/><w:gridCol w:w="3950"/></w:tblGrid><w:tr><w:trPr><w:trHeight w:val="432"/><w:jc w:val="center"/></w:trPr><w:tc><w:tcPr><w:tcW w:w="10165" w:type="dxa"/><w:gridSpan w:val="4"/><w:shd w:val="clear" w:color="auto" w:fill="E7E6E6"/><w:vAlign w:val="center"/></w:tcPr><w:p><w:pPr><w:numPr><w:ilvl w:val="0"/><w:numId w:val="10"/></w:numPr><w:pBdr><w:top w:val="nil"/><w:left w:val="nil"/><w:bottom w:val="nil"/><w:right w:val="nil"/><w:between w:val="nil"/></w:pBdr><w:spacing w:after="160" w:line="259" w:lineRule="auto"/><w:rPr><w:rFonts w:ascii="Times New Roman" w:eastAsia="Times New Roman" w:hAnsi="Times New Roman" w:cs="Times New Roman"/><w:b/><w:color w:val="000000"/><w:sz w:val="24"/><w:szCs w:val="24"/></w:rPr></w:pPr><w:r><w:rPr><w:rFonts w:ascii="Times New Roman" w:eastAsia="Times New Roman" w:hAnsi="Times New Roman" w:cs="Times New Roman"/><w:b/><w:color w:val="000000"/><w:sz w:val="24"/><w:szCs w:val="24"/></w:rPr><w:t>1</w:t></w:r><w:r><w:rPr><w:rFonts w:ascii="Times New Roman" w:eastAsia="Times New Roman" w:hAnsi="Times New Roman" w:cs="Times New Roman"/><w:b/><w:color w:val="000000"/><w:sz w:val="24"/><w:szCs w:val="24"/><w:vertAlign w:val="superscript"/></w:rPr><w:t>st</w:t></w:r><w:r><w:rPr><w:rFonts w:ascii="Times New Roman" w:eastAsia="Times New Roman" w:hAnsi="Times New Roman" w:cs="Times New Roman"/><w:b/><w:color w:val="000000"/><w:sz w:val="24"/><w:szCs w:val="24"/></w:rPr><w:t xml:space="preserve"> Member information</w:t></w:r></w:p></w:tc></w:tr><w:tr><w:trPr><w:trHeight w:val="540"/><w:jc w:val="center"/></w:trPr><w:tc><w:tcPr><w:tcW w:w="2113" w:type="dxa"/><w:vAlign w:val="center"/></w:tcPr><w:p><w:pPr><w:rPr><w:rFonts w:ascii="Times New Roman" w:eastAsia="Times New Roman" w:hAnsi="Times New Roman" w:cs="Times New Roman"/><w:b/><w:sz w:val="24"/><w:szCs w:val="24"/></w:rPr></w:pPr><w:r><w:rPr><w:rFonts w:ascii="Times New Roman" w:eastAsia="Times New Roman" w:hAnsi="Times New Roman" w:cs="Times New Roman"/><w:b/><w:sz w:val="24"/><w:szCs w:val="24"/></w:rPr><w:t>Student ID:</w:t></w:r></w:p></w:tc><w:tc><w:tcPr><w:tcW w:w="2332" w:type="dxa"/><w:vAlign w:val="center"/></w:tcPr><w:p><w:pPr><w:rPr><w:rFonts w:ascii="Times New Roman" w:eastAsia="Times New Roman" w:hAnsi="Times New Roman" w:cs="Times New Roman"/><w:b/><w:sz w:val="24"/><w:szCs w:val="24"/></w:rPr></w:pPr></w:p></w:tc><w:tc><w:tcPr><w:tcW w:w="1770" w:type="dxa"/><w:vAlign w:val="center"/></w:tcPr><w:p><w:pPr><w:rPr><w:rFonts w:ascii="Times New Roman" w:eastAsia="Times New Roman" w:hAnsi="Times New Roman" w:cs="Times New Roman"/><w:b/><w:sz w:val="24"/><w:szCs w:val="24"/></w:rPr></w:pPr><w:r><w:rPr><w:rFonts w:ascii="Times New Roman" w:eastAsia="Times New Roman" w:hAnsi="Times New Roman" w:cs="Times New Roman"/><w:b/><w:sz w:val="24"/><w:szCs w:val="24"/></w:rPr><w:t>Student Name:</w:t></w:r></w:p></w:tc><w:tc><w:tcPr><w:tcW w:w="3950" w:type="dxa"/><w:vAlign w:val="center"/></w:tcPr><w:p><w:pPr><w:rPr><w:rFonts w:ascii="Times New Roman" w:eastAsia="Times New Roman" w:hAnsi="Times New Roman" w:cs="Times New Roman"/><w:b/><w:sz w:val="24"/><w:szCs w:val="24"/></w:rPr></w:pPr></w:p></w:tc></w:tr><w:tr><w:trPr><w:trHeight w:val="432"/><w:jc w:val="center"/></w:trPr><w:tc><w:tcPr><w:tcW w:w="10165" w:type="dxa"/><w:gridSpan w:val="4"/><w:shd w:val="clear" w:color="auto" w:fill="E7E6E6"/><w:vAlign w:val="center"/></w:tcPr><w:p><w:pPr><w:numPr><w:ilvl w:val="0"/><w:numId w:val="10"/></w:numPr><w:pBdr><w:top w:val="nil"/><w:left w:val="nil"/><w:bottom w:val="nil"/><w:right w:val="nil"/><w:between w:val="nil"/></w:pBdr><w:spacing w:after="160" w:line="259" w:lineRule="auto"/><w:rPr><w:rFonts w:ascii="Times New Roman" w:eastAsia="Times New Roman" w:hAnsi="Times New Roman" w:cs="Times New Roman"/><w:b/><w:color w:val="000000"/><w:sz w:val="24"/><w:szCs w:val="24"/></w:rPr></w:pPr><w:r><w:rPr><w:rFonts w:ascii="Times New Roman" w:eastAsia="Times New Roman" w:hAnsi="Times New Roman" w:cs="Times New Roman"/><w:b/><w:color w:val="000000"/><w:sz w:val="24"/><w:szCs w:val="24"/></w:rPr><w:t>2</w:t></w:r><w:r><w:rPr><w:rFonts w:ascii="Times New Roman" w:eastAsia="Times New Roman" w:hAnsi="Times New Roman" w:cs="Times New Roman"/><w:b/><w:color w:val="000000"/><w:sz w:val="24"/><w:szCs w:val="24"/><w:vertAlign w:val="superscript"/></w:rPr><w:t>nd</w:t></w:r><w:r><w:rPr><w:rFonts w:ascii="Times New Roman" w:eastAsia="Times New Roman" w:hAnsi="Times New Roman" w:cs="Times New Roman"/><w:b/><w:color w:val="000000"/><w:sz w:val="24"/><w:szCs w:val="24"/></w:rPr><w:t xml:space="preserve"> Member information [</w:t></w:r><w:r><w:rPr><w:rFonts w:ascii="Times New Roman" w:eastAsia="Times New Roman" w:hAnsi="Times New Roman" w:cs="Times New Roman"/><w:b/><w:i/><w:color w:val="000000"/><w:sz w:val="24"/><w:szCs w:val="24"/></w:rPr><w:t xml:space="preserve"> if there is any. Otherwise, skip this]</w:t></w:r></w:p></w:tc></w:tr><w:tr><w:trPr><w:trHeight w:val="540"/><w:jc w:val="center"/></w:trPr><w:tc><w:tcPr><w:tcW w:w="2113" w:type="dxa"/><w:vAlign w:val="center"/></w:tcPr><w:p><w:pPr><w:rPr><w:rFonts w:ascii="Times New Roman" w:eastAsia="Times New Roman" w:hAnsi="Times New Roman" w:cs="Times New Roman"/><w:b/><w:sz w:val="24"/><w:szCs w:val="24"/></w:rPr></w:pPr><w:r><w:rPr><w:rFonts w:ascii="Times New Roman" w:eastAsia="Times New Roman" w:hAnsi="Times New Roman" w:cs="Times New Roman"/><w:b/><w:sz w:val="24"/><w:szCs w:val="24"/></w:rPr><w:t>Student ID:</w:t></w:r></w:p></w:tc><w:tc><w:tcPr><w:tcW w:w="2332" w:type="dxa"/><w:vAlign w:val="center"/></w:tcPr><w:p><w:pPr><w:rPr><w:rFonts w:ascii="Times New Roman" w:eastAsia="Times New Roman" w:hAnsi="Times New Roman" w:cs="Times New Roman"/><w:b/><w:sz w:val="24"/><w:szCs w:val="24"/></w:rPr></w:pPr></w:p></w:tc><w:tc><w:tcPr><w:tcW w:w="1770" w:type="dxa"/><w:vAlign w:val="center"/></w:tcPr><w:p><w:pPr><w:rPr><w:rFonts w:ascii="Times New Roman" w:eastAsia="Times New Roman" w:hAnsi="Times New Roman" w:cs="Times New Roman"/><w:b/><w:sz w:val="24"/><w:szCs w:val="24"/></w:rPr></w:pPr><w:r><w:rPr><w:rFonts w:ascii="Times New Roman" w:eastAsia="Times New Roman" w:hAnsi="Times New Roman" w:cs="Times New Roman"/><w:b/><w:sz w:val="24"/><w:szCs w:val="24"/></w:rPr><w:t>Student Name:</w:t></w:r></w:p></w:tc><w:tc><w:tcPr><w:tcW w:w="3950" w:type="dxa"/><w:vAlign w:val="center"/></w:tcPr><w:p><w:pPr><w:rPr><w:rFonts w:ascii="Times New Roman" w:eastAsia="Times New Roman" w:hAnsi="Times New Roman" w:cs="Times New Roman"/><w:b/><w:sz w:val="24"/><w:szCs w:val="24"/></w:rPr></w:pPr></w:p></w:tc></w:tr><w:tr><w:trPr><w:trHeight w:val="510"/><w:jc w:val="center"/></w:trPr><w:tc><w:tcPr><w:tcW w:w="2113" w:type="dxa"/><w:vAlign w:val="center"/></w:tcPr><w:p><w:pPr><w:rPr><w:rFonts w:ascii="Times New Roman" w:eastAsia="Times New Roman" w:hAnsi="Times New Roman" w:cs="Times New Roman"/><w:b/><w:sz w:val="24"/><w:szCs w:val="24"/></w:rPr></w:pPr><w:r><w:rPr><w:rFonts w:ascii="Times New Roman" w:eastAsia="Times New Roman" w:hAnsi="Times New Roman" w:cs="Times New Roman"/><w:b/><w:sz w:val="24"/><w:szCs w:val="24"/></w:rPr><w:t>Semester:</w:t></w:r></w:p></w:tc><w:tc><w:tcPr><w:tcW w:w="2332" w:type="dxa"/><w:vAlign w:val="center"/></w:tcPr><w:p><w:pPr><w:rPr><w:rFonts w:ascii="Times New Roman" w:eastAsia="Times New Roman" w:hAnsi="Times New Roman" w:cs="Times New Roman"/><w:b/><w:sz w:val="24"/><w:szCs w:val="24"/></w:rPr></w:pPr></w:p></w:tc><w:tc><w:tcPr><w:tcW w:w="1770" w:type="dxa"/><w:vAlign w:val="center"/></w:tcPr><w:p><w:pPr><w:rPr><w:rFonts w:ascii="Times New Roman" w:eastAsia="Times New Roman" w:hAnsi="Times New Roman" w:cs="Times New Roman"/><w:b/><w:sz w:val="24"/><w:szCs w:val="24"/></w:rPr></w:pPr><w:r><w:rPr><w:rFonts w:ascii="Times New Roman" w:eastAsia="Times New Roman" w:hAnsi="Times New Roman" w:cs="Times New Roman"/><w:b/><w:sz w:val="24"/><w:szCs w:val="24"/></w:rPr><w:t>Date:</w:t></w:r></w:p></w:tc><w:tc><w:tcPr><w:tcW w:w="3950" w:type="dxa"/><w:vAlign w:val="center"/></w:tcPr><w:p><w:pPr><w:rPr><w:rFonts w:ascii="Times New Roman" w:eastAsia="Times New Roman" w:hAnsi="Times New Roman" w:cs="Times New Roman"/><w:b/><w:sz w:val="24"/><w:szCs w:val="24"/></w:rPr></w:pPr></w:p></w:tc></w:tr><w:tr><w:trPr><w:trHeight w:val="800"/><w:jc w:val="center"/></w:trPr><w:tc><w:tcPr><w:tcW w:w="2113" w:type="dxa"/><w:vAlign w:val="center"/></w:tcPr><w:p><w:pPr><w:rPr><w:rFonts w:ascii="Times New Roman" w:eastAsia="Times New Roman" w:hAnsi="Times New Roman" w:cs="Times New Roman"/><w:b/><w:sz w:val="24"/><w:szCs w:val="24"/></w:rPr></w:pPr><w:r><w:rPr><w:rFonts w:ascii="Times New Roman" w:eastAsia="Times New Roman" w:hAnsi="Times New Roman" w:cs="Times New Roman"/><w:b/><w:sz w:val="24"/><w:szCs w:val="24"/></w:rPr><w:t>III. Proposed Title:</w:t></w:r></w:p></w:tc><w:tc><w:tcPr><w:tcW w:w="8052" w:type="dxa"/><w:gridSpan w:val="3"/><w:vAlign w:val="center"/></w:tcPr><w:p><w:pPr><w:spacing w:line="240" w:lineRule="auto"/><w:rPr><w:rFonts w:ascii="Times New Roman" w:hAnsi="Times New Roman"/><w:b/><w:sz w:val="22"/><w:szCs w:val="22"/><w:color w:val="0F172A"/></w:rPr></w:pPr><w:r><w:rPr><w:rFonts w:ascii="Times New Roman" w:hAnsi="Times New Roman"/><w:b/><w:sz w:val="22"/><w:szCs w:val="22"/><w:color w:val="0F172A"/></w:rPr><w:t>Nirapod Parking - A Microservice-Based Web Platform for Sharing Residential Parking Spaces in Urban Areas</w:t></w:r></w:p></w:tc></w:tr><w:tr><w:trPr><w:trHeight w:val="953"/><w:jc w:val="center"/></w:trPr><w:tc><w:tcPr><w:tcW w:w="2113" w:type="dxa"/><w:vAlign w:val="center"/></w:tcPr><w:p><w:pPr><w:spacing w:after="0"/></w:pPr><w:r><w:rPr><w:rFonts w:ascii="Times New Roman" w:eastAsia="Times New Roman" w:hAnsi="Times New Roman" w:cs="Times New Roman"/><w:b/><w:sz w:val="24"/><w:szCs w:val="24"/></w:rPr><w:t>IV. Updated Title (</w:t></w:r><w:r><w:rPr><w:rFonts w:ascii="Times New Roman" w:eastAsia="Times New Roman" w:hAnsi="Times New Roman" w:cs="Times New Roman"/><w:sz w:val="24"/><w:szCs w:val="24"/></w:rPr><w:t>If there is any update</w:t></w:r><w:r><w:rPr><w:rFonts w:ascii="Times New Roman" w:eastAsia="Times New Roman" w:hAnsi="Times New Roman" w:cs="Times New Roman"/><w:b/><w:sz w:val="24"/><w:szCs w:val="24"/></w:rPr><w:t>):</w:t></w:r></w:p></w:tc><w:tc><w:tcPr><w:tcW w:w="8052" w:type="dxa"/><w:gridSpan w:val="3"/><w:vAlign w:val="center"/></w:tcPr><w:p><w:pPr><w:rPr><w:rFonts w:ascii="Times New Roman" w:eastAsia="Times New Roman" w:hAnsi="Times New Roman" w:cs="Times New Roman"/><w:b/><w:sz w:val="24"/><w:szCs w:val="24"/></w:rPr></w:pPr></w:p></w:tc></w:tr><w:tr><w:trPr><w:trHeight w:val="2438"/><w:jc w:val="center"/></w:trPr><w:tc><w:tcPr><w:tcW w:w="10165" w:type="dxa"/><w:gridSpan w:val="4"/><w:shd w:val="clear" w:color="auto" w:fill="E7E6E6"/></w:tcPr><w:p><w:pPr><w:jc w:val="both"/><w:rPr><w:rFonts w:ascii="Times New Roman" w:eastAsia="Times New Roman" w:hAnsi="Times New Roman" w:cs="Times New Roman"/><w:sz w:val="6"/><w:szCs w:val="6"/></w:rPr></w:pPr></w:p><w:p><w:pPr><w:jc w:val="both"/><w:rPr><w:rFonts w:ascii="Times New Roman" w:eastAsia="Times New Roman" w:hAnsi="Times New Roman" w:cs="Times New Roman"/><w:b/><w:sz w:val="24"/><w:szCs w:val="24"/></w:rPr></w:pPr><w:r><w:rPr><w:rFonts w:ascii="Times New Roman" w:eastAsia="Times New Roman" w:hAnsi="Times New Roman" w:cs="Times New Roman"/><w:sz w:val="24"/><w:szCs w:val="24"/></w:rPr><w:t xml:space="preserve">This is the approval for the Final Year Design Project (FYDP) proposal and title submitted by the above-mentioned student who is from the Department of CSE under my supervision. Upon thorough review and evaluation, it is my professional opinion that the </w:t></w:r><w:r><w:rPr><w:rFonts w:ascii="Times New Roman" w:eastAsia="Times New Roman" w:hAnsi="Times New Roman" w:cs="Times New Roman"/><w:b/><w:sz w:val="24"/><w:szCs w:val="24"/></w:rPr><w:t xml:space="preserve">proposed project title </w:t></w:r><w:r><w:rPr><w:rFonts w:ascii="Times New Roman" w:eastAsia="Times New Roman" w:hAnsi="Times New Roman" w:cs="Times New Roman"/><w:b/><w:i/></w:rPr><w:t>[mentioned in Sec III and IV]</w:t></w:r><w:r><w:rPr><w:rFonts w:ascii="Times New Roman" w:eastAsia="Times New Roman" w:hAnsi="Times New Roman" w:cs="Times New Roman"/><w:b/></w:rPr><w:t xml:space="preserve"> </w:t></w:r><w:r><w:rPr><w:rFonts w:ascii="Times New Roman" w:eastAsia="Times New Roman" w:hAnsi="Times New Roman" w:cs="Times New Roman"/><w:sz w:val="24"/><w:szCs w:val="24"/></w:rPr><w:t>is both relevant and aligned with the academic goals and standards of our department. I (Supervisor) have endorsed the proposed proposal and title. Under our department's guidelines, the student has fulfilled all the necessary prerequisites and will attach this Proposal Approval Form to their FYDP Title Phase Evaluation Report.</w:t></w:r></w:p></w:tc></w:tr><w:tr><w:trPr><w:trHeight w:val="432"/><w:jc w:val="center"/></w:trPr><w:tc><w:tcPr><w:tcW w:w="2113" w:type="dxa"/></w:tcPr><w:p><w:pPr><w:rPr><w:rFonts w:ascii="Times New Roman" w:eastAsia="Times New Roman" w:hAnsi="Times New Roman" w:cs="Times New Roman"/><w:b/><w:sz w:val="24"/><w:szCs w:val="24"/></w:rPr></w:pPr><w:r><w:rPr><w:rFonts w:ascii="Times New Roman" w:eastAsia="Times New Roman" w:hAnsi="Times New Roman" w:cs="Times New Roman"/><w:b/><w:sz w:val="24"/><w:szCs w:val="24"/></w:rPr><w:t xml:space="preserve">Supervisor Name: </w:t></w:r></w:p></w:tc><w:tc><w:tcPr><w:tcW w:w="8052" w:type="dxa"/><w:gridSpan w:val="3"/><w:vAlign w:val="center"/></w:tcPr><w:p><w:pPr><w:rPr><w:rFonts w:ascii="Times New Roman" w:eastAsia="Times New Roman" w:hAnsi="Times New Roman" w:cs="Times New Roman"/><w:b/><w:sz w:val="24"/><w:szCs w:val="24"/></w:rPr></w:pPr></w:p></w:tc></w:tr><w:tr><w:trPr><w:trHeight w:val="432"/><w:jc w:val="center"/></w:trPr><w:tc><w:tcPr><w:tcW w:w="2113" w:type="dxa"/></w:tcPr><w:p><w:pPr><w:rPr><w:rFonts w:ascii="Times New Roman" w:eastAsia="Times New Roman" w:hAnsi="Times New Roman" w:cs="Times New Roman"/><w:b/><w:sz w:val="24"/><w:szCs w:val="24"/></w:rPr></w:pPr><w:r><w:rPr><w:rFonts w:ascii="Times New Roman" w:eastAsia="Times New Roman" w:hAnsi="Times New Roman" w:cs="Times New Roman"/><w:b/><w:sz w:val="24"/><w:szCs w:val="24"/></w:rPr><w:t xml:space="preserve">Supervisor Designation: </w:t></w:r></w:p></w:tc><w:tc><w:tcPr><w:tcW w:w="8052" w:type="dxa"/><w:gridSpan w:val="3"/><w:vAlign w:val="center"/></w:tcPr><w:p><w:pPr><w:rPr><w:rFonts w:ascii="Times New Roman" w:eastAsia="Times New Roman" w:hAnsi="Times New Roman" w:cs="Times New Roman"/><w:b/><w:sz w:val="18"/><w:szCs w:val="24"/></w:rPr></w:pPr></w:p></w:tc></w:tr><w:tr><w:trPr><w:trHeight w:val="1790"/><w:jc w:val="center"/></w:trPr><w:tc><w:tcPr><w:tcW w:w="10165" w:type="dxa"/><w:gridSpan w:val="4"/><w:vAlign w:val="center"/></w:tcPr><w:p><w:pPr><w:ind w:right="71"/><w:jc w:val="center"/><w:rPr><w:rFonts w:ascii="Times New Roman" w:eastAsia="Times New Roman" w:hAnsi="Times New Roman" w:cs="Times New Roman"/><w:b/><w:sz w:val="24"/><w:szCs w:val="24"/><w:u w:val="single"/></w:rPr></w:pPr><w:r><w:rPr><w:rFonts w:ascii="Times New Roman" w:eastAsia="Times New Roman" w:hAnsi="Times New Roman" w:cs="Times New Roman"/><w:b/><w:sz w:val="24"/><w:szCs w:val="24"/><w:u w:val="single"/></w:rPr><w:t>Approved by:</w:t></w:r></w:p><w:p><w:pPr><w:ind w:right="71"/><w:rPr><w:rFonts w:ascii="Times New Roman" w:eastAsia="Times New Roman" w:hAnsi="Times New Roman" w:cs="Times New Roman"/><w:b/><w:sz w:val="14"/><w:szCs w:val="24"/></w:rPr></w:pPr></w:p><w:p><w:pPr><w:spacing w:after="0"/><w:ind w:right="71"/><w:jc w:val="center"/><w:rPr><w:rFonts w:ascii="Times New Roman" w:eastAsia="Times New Roman" w:hAnsi="Times New Roman" w:cs="Times New Roman"/><w:b/><w:sz w:val="24"/><w:szCs w:val="24"/></w:rPr></w:pPr><w:r><w:rPr><w:rFonts w:ascii="Times New Roman" w:eastAsia="Times New Roman" w:hAnsi="Times New Roman" w:cs="Times New Roman"/><w:b/><w:sz w:val="24"/><w:szCs w:val="24"/></w:rPr><w:t>___________________________</w:t></w:r></w:p><w:p><w:pPr><w:spacing w:after="0"/><w:ind w:right="71"/><w:jc w:val="center"/><w:rPr><w:rFonts w:ascii="Times New Roman" w:eastAsia="Times New Roman" w:hAnsi="Times New Roman" w:cs="Times New Roman"/><w:b/><w:sz w:val="24"/><w:szCs w:val="24"/></w:rPr></w:pPr><w:r><w:rPr><w:rFonts w:ascii="Times New Roman" w:eastAsia="Times New Roman" w:hAnsi="Times New Roman" w:cs="Times New Roman"/><w:b/><w:sz w:val="24"/><w:szCs w:val="24"/></w:rPr><w:t>Supervisor Signature with Date</w:t></w:r></w:p></w:tc></w:tr></w:tbl><w:p><w:pPr><w:p><w:r><w:br w:type="page"/></w:r></w:p>
 <w:p><w:pPr><w:spacing w:before="240" w:after="100"/><w:rPr><w:rFonts w:ascii="Times New Roman" w:hAnsi="Times New Roman"/><w:b/><w:sz w:val="30"/><w:szCs w:val="30"/><w:color w:val="0F172A"/></w:rPr></w:pPr><w:r><w:rPr><w:rFonts w:ascii="Times New Roman" w:hAnsi="Times New Roman"/><w:b/><w:sz w:val="30"/><w:szCs w:val="30"/><w:color w:val="0F172A"/></w:rPr><w:t>V. Detailed Proposal</w:t></w:r></w:p>
 <w:p><w:pPr><w:spacing w:before="240" w:after="100"/><w:rPr><w:rFonts w:ascii="Times New Roman" w:hAnsi="Times New Roman"/><w:b/><w:sz w:val="26"/><w:szCs w:val="26"/><w:color w:val="1E3A8A"/></w:rPr></w:pPr><w:r><w:rPr><w:rFonts w:ascii="Times New Roman" w:hAnsi="Times New Roman"/><w:b/><w:sz w:val="26"/><w:szCs w:val="26"/><w:color w:val="1E3A8A"/></w:rPr><w:t>1. Objective</w:t></w:r></w:p>
 <w:p><w:pPr><w:spacing w:after="120" w:line="276" w:lineRule="auto"/><w:jc w:val="both"/><w:rPr><w:rFonts w:ascii="Times New Roman" w:hAnsi="Times New Roman"/><w:sz w:val="22"/><w:szCs w:val="22"/><w:color w:val="1E293B"/></w:rPr></w:pPr><w:r><w:rPr><w:rFonts w:ascii="Times New Roman" w:hAnsi="Times New Roman"/><w:sz w:val="22"/><w:szCs w:val="22"/><w:color w:val="1E293B"/></w:rPr><w:t xml:space="preserve">The main objective of this project is to develop Nirapod Parking, an easy-to-use web platform designed for crowded urban centers like Dhaka and Chattogram. The platform connects Vehicle Owners (commuters driving cars or motorcycles) who need safe, temporary parking with Parking Spot Owners (residential flat owners or authorized residents) who have empty, unused garage spaces. Through our system, drivers can easily find and reserve parking for a few hours, for a full workday, overnight, or on a monthly subscription basis.</w:t></w:r></w:p>
@@ -16,13 +16,13 @@
 <w:p><w:pPr><w:spacing w:after="120" w:line="276" w:lineRule="auto"/><w:jc w:val="both"/><w:rPr><w:rFonts w:ascii="Times New Roman" w:hAnsi="Times New Roman"/><w:sz w:val="22"/><w:szCs w:val="22"/><w:color w:val="1E293B"/></w:rPr></w:pPr><w:r><w:rPr><w:rFonts w:ascii="Times New Roman" w:hAnsi="Times New Roman"/><w:sz w:val="22"/><w:szCs w:val="22"/><w:color w:val="1E293B"/></w:rPr><w:t xml:space="preserve">Second, in Western countries, commercial platforms such as JustPark in the UK and SpotHero in the USA popularized peer-to-peer parking sharing by letting homeowners rent out their private driveways through mobile apps. These platforms proved that sharing private parking spaces works effectively, generates passive income for property owners, and takes cars off busy roads. However, these apps were designed for Western single-family suburban houses with open, unmonitored driveways and direct credit card billing. In Dhaka and Chattogram, residential buildings are multi-story apartment complexes with locked gates, on-duty Security Guards, and multiple residential flat owners sharing the same ground-floor garage. Foreign apps offer no mechanism to verify flat ownership, handle building security, or support gate security staff.</w:t></w:r></w:p>
 <w:p><w:pPr><w:spacing w:after="120" w:line="276" w:lineRule="auto"/><w:jc w:val="both"/><w:rPr><w:rFonts w:ascii="Times New Roman" w:hAnsi="Times New Roman"/><w:sz w:val="22"/><w:szCs w:val="22"/><w:color w:val="1E293B"/></w:rPr></w:pPr><w:r><w:rPr><w:rFonts w:ascii="Times New Roman" w:hAnsi="Times New Roman"/><w:sz w:val="22"/><w:szCs w:val="22"/><w:color w:val="1E293B"/></w:rPr><w:t xml:space="preserve">Third, in Bangladesh, platforms like Pathao, Uber, and Jatri successfully modernized ride-sharing and bus ticketing, but vehicle parking was completely left out of this digital transition. Currently, parking in cities like Dhaka relies either on commercial shopping mall basements, informal roadside parking with cash slips, or handwritten paper 'Garage To-Let' notices pasted on building boundary walls. These manual paper notices are slow, unorganized, completely unverified, and only work for long-term monthly rentals. They cannot help a commuter who needs a safe spot for just two hours during a meeting or overnight for an event. Nirapod Parking steps in to bridge these gaps by providing a modern web platform built specifically around local residential customs.</w:t></w:r></w:p>
 <w:p><w:pPr><w:spacing w:before="240" w:after="100"/><w:rPr><w:rFonts w:ascii="Times New Roman" w:hAnsi="Times New Roman"/><w:b/><w:sz w:val="26"/><w:szCs w:val="26"/><w:color w:val="1E3A8A"/></w:rPr></w:pPr><w:r><w:rPr><w:rFonts w:ascii="Times New Roman" w:hAnsi="Times New Roman"/><w:b/><w:sz w:val="26"/><w:szCs w:val="26"/><w:color w:val="1E3A8A"/></w:rPr><w:t>4. Gap Analysis</w:t></w:r></w:p>
-<w:p><w:pPr><w:spacing w:after="120" w:line="276" w:lineRule="auto"/><w:jc w:val="both"/><w:rPr><w:rFonts w:ascii="Times New Roman" w:hAnsi="Times New Roman"/><w:sz w:val="22"/><w:szCs w:val="22"/><w:color w:val="1E293B"/></w:rPr></w:pPr><w:r><w:rPr><w:rFonts w:ascii="Times New Roman" w:hAnsi="Times New Roman"/><w:sz w:val="22"/><w:szCs w:val="22"/><w:color w:val="1E293B"/></w:rPr><w:t xml:space="preserve">Although previous academic papers and commercial apps have addressed parking, they break down when applied to the realities of crowded residential neighborhoods in Bangladesh. Our analysis identifies four critical practical and technical barriers:</w:t></w:r></w:p>
-<w:p><w:pPr><w:spacing w:after="120" w:line="276" w:lineRule="auto"/><w:jc w:val="both"/><w:rPr><w:rFonts w:ascii="Times New Roman" w:hAnsi="Times New Roman"/><w:sz w:val="22"/><w:szCs w:val="22"/><w:color w:val="1E293B"/></w:rPr></w:pPr><w:r><w:rPr><w:rFonts w:ascii="Times New Roman" w:hAnsi="Times New Roman"/><w:sz w:val="22"/><w:szCs w:val="22"/><w:color w:val="1E293B"/></w:rPr><w:t xml:space="preserve">1. The Hardware and Cost Barrier: Academic smart parking models require dedicated physical sensors, electrical wiring, and automated boom barriers at every parking bay. Installing and maintaining costly hardware across private residential apartment buildings in Dhaka is financially unrealistic for ordinary flat owners.</w:t></w:r></w:p>
-<w:p><w:pPr><w:spacing w:after="120" w:line="276" w:lineRule="auto"/><w:jc w:val="both"/><w:rPr><w:rFonts w:ascii="Times New Roman" w:hAnsi="Times New Roman"/><w:sz w:val="22"/><w:szCs w:val="22"/><w:color w:val="1E293B"/></w:rPr></w:pPr><w:r><w:rPr><w:rFonts w:ascii="Times New Roman" w:hAnsi="Times New Roman"/><w:sz w:val="22"/><w:szCs w:val="22"/><w:color w:val="1E293B"/></w:rPr><w:t xml:space="preserve">2. The Building Structure and Trust Barrier: International apps like JustPark assume open, single-family driveways. In Dhaka, residential buildings have locked gates, and multiple flat owners share the same garage. Letting unverified strangers into the building creates serious security concerns for residents. Existing foreign apps and local paper signs provide zero background verification.</w:t></w:r></w:p>
-<w:p><w:pPr><w:spacing w:after="120" w:line="276" w:lineRule="auto"/><w:jc w:val="both"/><w:rPr><w:rFonts w:ascii="Times New Roman" w:hAnsi="Times New Roman"/><w:sz w:val="22"/><w:szCs w:val="22"/><w:color w:val="1E293B"/></w:rPr></w:pPr><w:r><w:rPr><w:rFonts w:ascii="Times New Roman" w:hAnsi="Times New Roman"/><w:sz w:val="22"/><w:szCs w:val="22"/><w:color w:val="1E293B"/></w:rPr><w:t xml:space="preserve">3. The Gate Usability Barrier: Smart city research papers assume automated electronic barrier gates. In Bangladesh, building entry is managed by human Security Guards (Darwans). Systems that require guards to use complex smartphone apps or scan digital codes fail in practice due to usability and technical friction.</w:t></w:r></w:p>
-<w:p><w:pPr><w:spacing w:after="120" w:line="276" w:lineRule="auto"/><w:jc w:val="both"/><w:rPr><w:rFonts w:ascii="Times New Roman" w:hAnsi="Times New Roman"/><w:sz w:val="22"/><w:szCs w:val="22"/><w:color w:val="1E293B"/></w:rPr></w:pPr><w:r><w:rPr><w:rFonts w:ascii="Times New Roman" w:hAnsi="Times New Roman"/><w:sz w:val="22"/><w:szCs w:val="22"/><w:color w:val="1E293B"/></w:rPr><w:t xml:space="preserve">4. The UI/UX Map Collision Barrier: In multi-story Dhaka buildings where three or four different flat owners list their parking spots, standard map applications drop multiple marker pins at the exact same GPS coordinate. This causes pins to overlap, creating visual clutter that makes individual spots impossible for Vehicle Owners to click or select.</w:t></w:r></w:p>
-<w:p><w:pPr><w:spacing w:after="120" w:line="276" w:lineRule="auto"/><w:jc w:val="both"/><w:rPr><w:rFonts w:ascii="Times New Roman" w:hAnsi="Times New Roman"/><w:sz w:val="22"/><w:szCs w:val="22"/><w:color w:val="1E293B"/></w:rPr></w:pPr><w:r><w:rPr><w:rFonts w:ascii="Times New Roman" w:hAnsi="Times New Roman"/><w:sz w:val="22"/><w:szCs w:val="22"/><w:color w:val="1E293B"/></w:rPr><w:t xml:space="preserve">Nirapod Parking overcomes these barriers through a software-first approach tailored to local needs. The platform operates entirely through standard web browsers using device GPS and SQL distance formulas, completely eliminating the need for expensive physical sensors or barrier gates. To establish trust and maintain building security, an Admin reviews the Parking Spot Owner's National ID, flat allotment or tax slip, and a clear photo of the parking slot before any listing is published. Furthermore, when a booking is confirmed, the system generates a digital pass showing the vehicle's license plate number so that the building's Security Guard can verify incoming cars and motorbikes with a quick visual check at the gate, without needing a smartphone or app. On the user interface, Leaflet marker clustering groups multiple spots in the same building into a single clean pin that smoothly expands when clicked, while our flexible booking engine supports hourly, daily, overnight, and monthly reservations for both cars and motorcycles.</w:t></w:r></w:p>
-<w:p><w:pPr><w:spacing w:after="120" w:line="276" w:lineRule="auto"/><w:jc w:val="both"/><w:rPr><w:rFonts w:ascii="Times New Roman" w:hAnsi="Times New Roman"/><w:sz w:val="22"/><w:szCs w:val="22"/><w:color w:val="1E293B"/></w:rPr></w:pPr><w:r><w:rPr><w:rFonts w:ascii="Times New Roman" w:hAnsi="Times New Roman"/><w:sz w:val="22"/><w:szCs w:val="22"/><w:color w:val="1E293B"/></w:rPr><w:t xml:space="preserve">Through this combination of features, the project directly addresses the disconnection between chaotic street parking and thousands of idle residential garage spaces across Dhaka and Chattogram. By providing a verified, low-cost digital bridge between Vehicle Owners and residential flat owners, it eliminates street parking dangers (vehicle damage, parts theft, and police towing fines) and road congestion, while allowing flat owners to earn steady supplemental income from empty garage spaces.</w:t></w:r></w:p>
+<w:p><w:pPr><w:spacing w:after="120" w:line="276" w:lineRule="auto"/><w:jc w:val="both"/><w:rPr><w:rFonts w:ascii="Times New Roman" w:hAnsi="Times New Roman"/><w:sz w:val="22"/><w:szCs w:val="22"/><w:color w:val="1E293B"/></w:rPr></w:pPr><w:r><w:rPr><w:rFonts w:ascii="Times New Roman" w:hAnsi="Times New Roman"/><w:sz w:val="22"/><w:szCs w:val="22"/><w:color w:val="1E293B"/></w:rPr><w:t xml:space="preserve">While international commercial platforms like JustPark (UK) and SpotHero (USA) allow people to share parking in Western countries, and university research papers often propose smart automated parking, they break down when applied to the realities of cities like Dhaka and Chattogram. Our analysis identifies five realistic practical gaps:</w:t></w:r></w:p>
+<w:p><w:pPr><w:spacing w:after="120" w:line="276" w:lineRule="auto"/><w:jc w:val="both"/><w:rPr><w:rFonts w:ascii="Times New Roman" w:hAnsi="Times New Roman"/><w:sz w:val="22"/><w:szCs w:val="22"/><w:color w:val="1E293B"/></w:rPr></w:pPr><w:r><w:rPr><w:rFonts w:ascii="Times New Roman" w:hAnsi="Times New Roman"/><w:sz w:val="22"/><w:szCs w:val="22"/><w:color w:val="1E293B"/></w:rPr><w:t xml:space="preserve">1. The Expensive Hardware &amp; Maintenance Gap (Academic IoT Papers): Most academic research papers suggest installing ultrasonic ground sensors, surveillance cameras, and automated barrier gates connected to microcontrollers like Arduino or Raspberry Pi. In real life, who will pay ৳50,000 to ৳100,000 to install and maintain sensors and wiring in an ordinary residential garage just for a few parking bays? Flat owners will not spend that money, and hardware easily breaks down from dust, rain, and power cuts. Nirapod Parking requires zero physical hardware or sensors—the entire system runs through standard web browsers and phones using device GPS and SQL distance math.</w:t></w:r></w:p>
+<w:p><w:pPr><w:spacing w:after="120" w:line="276" w:lineRule="auto"/><w:jc w:val="both"/><w:rPr><w:rFonts w:ascii="Times New Roman" w:hAnsi="Times New Roman"/><w:sz w:val="22"/><w:szCs w:val="22"/><w:color w:val="1E293B"/></w:rPr></w:pPr><w:r><w:rPr><w:rFonts w:ascii="Times New Roman" w:hAnsi="Times New Roman"/><w:sz w:val="22"/><w:szCs w:val="22"/><w:color w:val="1E293B"/></w:rPr><w:t xml:space="preserve">2. The Open Driveway vs. Locked Compound Gap (JustPark &amp; SpotHero): In the UK or USA, JustPark and SpotHero work because Western homes are single-family houses with open personal driveways right in front of the lawn. A driver simply pulls in from the street without opening any gate or talking to anyone. In Dhaka, we do not have open private driveways. Almost all parking is located inside the ground floor or basement of multi-story apartment buildings behind locked boundary gates. Foreign apps have no workflow to handle gated, multi-family apartment buildings.</w:t></w:r></w:p>
+<w:p><w:pPr><w:spacing w:after="120" w:line="276" w:lineRule="auto"/><w:jc w:val="both"/><w:rPr><w:rFonts w:ascii="Times New Roman" w:hAnsi="Times New Roman"/><w:sz w:val="22"/><w:szCs w:val="22"/><w:color w:val="1E293B"/></w:rPr></w:pPr><w:r><w:rPr><w:rFonts w:ascii="Times New Roman" w:hAnsi="Times New Roman"/><w:sz w:val="22"/><w:szCs w:val="22"/><w:color w:val="1E293B"/></w:rPr><w:t xml:space="preserve">3. The Security Guard (Darwan) Usability Gap: Smart city research papers assume automated electronic gates, and Western apps assume no human interaction is needed. In Bangladesh, building entry is strictly managed by human Security Guards (Darwans). Most guards are elderly, not tech-savvy, and many do not carry smartphones. Expecting a guard to download a mobile app, scan complex QR codes, or manage software will fail in real life. Nirapod Parking solves this by showing the vehicle's license plate number in big, bold text on the driver's phone screen. The guard only has to take a quick 3-second visual check of the car or bike plate before opening the gate manually.</w:t></w:r></w:p>
+<w:p><w:pPr><w:spacing w:after="120" w:line="276" w:lineRule="auto"/><w:jc w:val="both"/><w:rPr><w:rFonts w:ascii="Times New Roman" w:hAnsi="Times New Roman"/><w:sz w:val="22"/><w:szCs w:val="22"/><w:color w:val="1E293B"/></w:rPr></w:pPr><w:r><w:rPr><w:rFonts w:ascii="Times New Roman" w:hAnsi="Times New Roman"/><w:sz w:val="22"/><w:szCs w:val="22"/><w:color w:val="1E293B"/></w:rPr><w:t xml:space="preserve">4. The Building Trust &amp; Shared Safety Gap (JustPark &amp; SpotHero): On JustPark, anyone can sign up with an address because if something goes wrong, it only affects their own private front yard. But in a Dhaka apartment building, 10 to 30 families live in the same building. If an unverified stranger drives inside the compound, other flat owners immediately worry about vehicle theft, children playing downstairs, and home security. Furthermore, how do we know the person renting the spot actually owns that flat? To solve this, Nirapod Parking requires a mandatory 3-point KYC check (National ID card, flat allotment slip or utility bill, and garage photos), which is verified by an Admin before any listing is published.</w:t></w:r></w:p>
+<w:p><w:pPr><w:spacing w:after="120" w:line="276" w:lineRule="auto"/><w:jc w:val="both"/><w:rPr><w:rFonts w:ascii="Times New Roman" w:hAnsi="Times New Roman"/><w:sz w:val="22"/><w:szCs w:val="22"/><w:color w:val="1E293B"/></w:rPr></w:pPr><w:r><w:rPr><w:rFonts w:ascii="Times New Roman" w:hAnsi="Times New Roman"/><w:sz w:val="22"/><w:szCs w:val="22"/><w:color w:val="1E293B"/></w:rPr><w:t xml:space="preserve">5. The Motorcycle Reality &amp; Map Pin Stacking Gap: Western apps like JustPark and SpotHero are built almost entirely for cars. But in Dhaka, more than half of daily commuters ride motorcycles. A single car parking bay can easily accommodate 4 or 5 motorbikes. If a system only allows full car rentals, motorbikes are left on the street. In addition, when 2 or 3 flat owners in the same apartment building list their empty parking spots on a map, standard apps drop multiple pins at the exact same GPS coordinate, making them stack on top of each other and impossible to tap. Nirapod Parking solves both problems by letting hosts list flexible slots for cars and motorcycles, and using Leaflet marker clustering to bundle spots in the same building into one clean, clickable pin that expands smoothly.</w:t></w:r></w:p>
+<w:p><w:pPr><w:spacing w:after="120" w:line="276" w:lineRule="auto"/><w:jc w:val="both"/><w:rPr><w:rFonts w:ascii="Times New Roman" w:hAnsi="Times New Roman"/><w:sz w:val="22"/><w:szCs w:val="22"/><w:color w:val="1E293B"/></w:rPr></w:pPr><w:r><w:rPr><w:rFonts w:ascii="Times New Roman" w:hAnsi="Times New Roman"/><w:sz w:val="22"/><w:szCs w:val="22"/><w:color w:val="1E293B"/></w:rPr><w:t xml:space="preserve">Through this combination of software-first features, Nirapod Parking directly bridges the gap between chaotic street parking and thousands of idle residential garage spaces across Dhaka and Chattogram. It eliminates street parking dangers (vehicle damage, parts theft, and police towing fines) and road congestion, while allowing residential flat owners to earn steady supplemental income (estimated at ৳3,000 to ৳8,000 per month) from empty garage spaces.</w:t></w:r></w:p>
 <w:p><w:pPr><w:spacing w:before="240" w:after="100"/><w:rPr><w:rFonts w:ascii="Times New Roman" w:hAnsi="Times New Roman"/><w:b/><w:sz w:val="26"/><w:szCs w:val="26"/><w:color w:val="1E3A8A"/></w:rPr></w:pPr><w:r><w:rPr><w:rFonts w:ascii="Times New Roman" w:hAnsi="Times New Roman"/><w:b/><w:sz w:val="26"/><w:szCs w:val="26"/><w:color w:val="1E3A8A"/></w:rPr><w:t>5. Methodology</w:t></w:r></w:p>
 <w:p><w:pPr><w:spacing w:after="120" w:line="276" w:lineRule="auto"/><w:jc w:val="both"/><w:rPr><w:rFonts w:ascii="Times New Roman" w:hAnsi="Times New Roman"/><w:sz w:val="22"/><w:szCs w:val="22"/><w:color w:val="1E293B"/></w:rPr></w:pPr><w:r><w:rPr><w:rFonts w:ascii="Times New Roman" w:hAnsi="Times New Roman"/><w:sz w:val="22"/><w:szCs w:val="22"/><w:color w:val="1E293B"/></w:rPr><w:t xml:space="preserve">We will execute this project using an Agile incremental development methodology divided into three clear development stages:</w:t></w:r></w:p>
 <w:p><w:pPr><w:ind w:left="400" w:hanging="200"/><w:spacing w:after="80" w:line="260" w:lineRule="auto"/><w:jc w:val="both"/><w:rPr><w:rFonts w:ascii="Times New Roman" w:hAnsi="Times New Roman"/><w:sz w:val="22"/><w:szCs w:val="22"/><w:color w:val="1E293B"/></w:rPr></w:pPr><w:r><w:rPr><w:rFonts w:ascii="Times New Roman" w:hAnsi="Times New Roman"/><w:b/><w:sz w:val="22"/><w:szCs w:val="22"/><w:color w:val="0F172A"/></w:rPr><w:t xml:space="preserve">•  Stage 1 (Core MVP): </w:t></w:r><w:r><w:rPr><w:rFonts w:ascii="Times New Roman" w:hAnsi="Times New Roman"/><w:sz w:val="22"/><w:szCs w:val="22"/><w:color w:val="1E293B"/></w:rPr><w:t xml:space="preserve">Setting up the distributed microservices backend infrastructure, centralized user authentication, and basic spot listing and reservation workflows.</w:t></w:r></w:p>

</xml_diff>